<commit_message>
Update full API documentation with refresh token and forgot password
Regenerate NexusLexis API docs v1.1 with production URLs and new Auth endpoints.

Co-authored-by: Cursor <cursoragent@cursor.com>
</commit_message>
<xml_diff>
--- a/docs/NEXUSLEXIS-API-REFERENCE.docx
+++ b/docs/NEXUSLEXIS-API-REFERENCE.docx
@@ -80,7 +80,7 @@
           </w:tcPr>
           <w:p>
             <w:r>
-              <w:t>1.0</w:t>
+              <w:t>1.1</w:t>
             </w:r>
           </w:p>
         </w:tc>
@@ -103,7 +103,7 @@
           </w:tcPr>
           <w:p>
             <w:r>
-              <w:t>2026-07-28</w:t>
+              <w:t>2026-07-29</w:t>
             </w:r>
           </w:p>
         </w:tc>
@@ -9359,7 +9359,7 @@
                 <w:rFonts w:ascii="Consolas" w:hAnsi="Consolas"/>
                 <w:sz w:val="16"/>
               </w:rPr>
-              <w:t>{ token, user }</w:t>
+              <w:t>{ accessToken, refreshToken, token, user }</w:t>
             </w:r>
             <w:r>
               <w:rPr>
@@ -9999,7 +9999,7 @@
                 <w:rFonts w:ascii="Consolas" w:hAnsi="Consolas"/>
                 <w:sz w:val="16"/>
               </w:rPr>
-              <w:t>{ token, user }</w:t>
+              <w:t>{ accessToken, refreshToken, token, user }</w:t>
             </w:r>
             <w:r>
               <w:rPr>
@@ -10059,7 +10059,7 @@
               <w:rPr>
                 <w:sz w:val="16"/>
               </w:rPr>
-              <w:t>GET</w:t>
+              <w:t>POST</w:t>
             </w:r>
           </w:p>
         </w:tc>
@@ -10083,7 +10083,7 @@
                 <w:rFonts w:ascii="Consolas" w:hAnsi="Consolas"/>
                 <w:sz w:val="16"/>
               </w:rPr>
-              <w:t>/api/auth/me</w:t>
+              <w:t>/api/auth/refresh</w:t>
             </w:r>
             <w:r>
               <w:rPr>
@@ -10106,7 +10106,7 @@
               <w:rPr>
                 <w:sz w:val="16"/>
               </w:rPr>
-              <w:t>JWT</w:t>
+              <w:t>Public</w:t>
             </w:r>
           </w:p>
         </w:tc>
@@ -10124,7 +10124,18 @@
               <w:rPr>
                 <w:sz w:val="16"/>
               </w:rPr>
-              <w:t>—</w:t>
+            </w:r>
+            <w:r>
+              <w:rPr>
+                <w:rFonts w:ascii="Consolas" w:hAnsi="Consolas"/>
+                <w:sz w:val="16"/>
+              </w:rPr>
+              <w:t>{ refreshToken }</w:t>
+            </w:r>
+            <w:r>
+              <w:rPr>
+                <w:sz w:val="16"/>
+              </w:rPr>
             </w:r>
           </w:p>
         </w:tc>
@@ -10148,7 +10159,7 @@
                 <w:rFonts w:ascii="Consolas" w:hAnsi="Consolas"/>
                 <w:sz w:val="16"/>
               </w:rPr>
-              <w:t>{ user }</w:t>
+              <w:t>{ accessToken, refreshToken, token, user }</w:t>
             </w:r>
             <w:r>
               <w:rPr>
@@ -10171,7 +10182,7 @@
               <w:rPr>
                 <w:sz w:val="16"/>
               </w:rPr>
-              <w:t>Current user + profile</w:t>
+              <w:t>Rotate refresh token → new access token</w:t>
             </w:r>
           </w:p>
         </w:tc>
@@ -10208,7 +10219,7 @@
               <w:rPr>
                 <w:sz w:val="16"/>
               </w:rPr>
-              <w:t>GET</w:t>
+              <w:t>POST</w:t>
             </w:r>
           </w:p>
         </w:tc>
@@ -10232,7 +10243,7 @@
                 <w:rFonts w:ascii="Consolas" w:hAnsi="Consolas"/>
                 <w:sz w:val="16"/>
               </w:rPr>
-              <w:t>/api/auth/roles</w:t>
+              <w:t>/api/auth/logout</w:t>
             </w:r>
             <w:r>
               <w:rPr>
@@ -10273,7 +10284,18 @@
               <w:rPr>
                 <w:sz w:val="16"/>
               </w:rPr>
-              <w:t>—</w:t>
+            </w:r>
+            <w:r>
+              <w:rPr>
+                <w:rFonts w:ascii="Consolas" w:hAnsi="Consolas"/>
+                <w:sz w:val="16"/>
+              </w:rPr>
+              <w:t>{ refreshToken }</w:t>
+            </w:r>
+            <w:r>
+              <w:rPr>
+                <w:sz w:val="16"/>
+              </w:rPr>
             </w:r>
           </w:p>
         </w:tc>
@@ -10297,7 +10319,7 @@
                 <w:rFonts w:ascii="Consolas" w:hAnsi="Consolas"/>
                 <w:sz w:val="16"/>
               </w:rPr>
-              <w:t>{ registerRoles, allRoles }</w:t>
+              <w:t>{ ok, message }</w:t>
             </w:r>
             <w:r>
               <w:rPr>
@@ -10320,7 +10342,7 @@
               <w:rPr>
                 <w:sz w:val="16"/>
               </w:rPr>
-              <w:t>Available roles</w:t>
+              <w:t>Revoke refresh token</w:t>
             </w:r>
           </w:p>
         </w:tc>
@@ -10357,7 +10379,7 @@
               <w:rPr>
                 <w:sz w:val="16"/>
               </w:rPr>
-              <w:t>GET</w:t>
+              <w:t>POST</w:t>
             </w:r>
           </w:p>
         </w:tc>
@@ -10381,7 +10403,7 @@
                 <w:rFonts w:ascii="Consolas" w:hAnsi="Consolas"/>
                 <w:sz w:val="16"/>
               </w:rPr>
-              <w:t>/api/auth/google/url</w:t>
+              <w:t>/api/auth/forgot-password</w:t>
             </w:r>
             <w:r>
               <w:rPr>
@@ -10428,7 +10450,7 @@
                 <w:rFonts w:ascii="Consolas" w:hAnsi="Consolas"/>
                 <w:sz w:val="16"/>
               </w:rPr>
-              <w:t>?state=login</w:t>
+              <w:t>{ email }</w:t>
             </w:r>
             <w:r>
               <w:rPr>
@@ -10457,7 +10479,7 @@
                 <w:rFonts w:ascii="Consolas" w:hAnsi="Consolas"/>
                 <w:sz w:val="16"/>
               </w:rPr>
-              <w:t>{ url }</w:t>
+              <w:t>{ ok, message }</w:t>
             </w:r>
             <w:r>
               <w:rPr>
@@ -10480,7 +10502,7 @@
               <w:rPr>
                 <w:sz w:val="16"/>
               </w:rPr>
-              <w:t>Google OAuth URL</w:t>
+              <w:t>Send password reset OTP email</w:t>
             </w:r>
           </w:p>
         </w:tc>
@@ -10517,7 +10539,7 @@
               <w:rPr>
                 <w:sz w:val="16"/>
               </w:rPr>
-              <w:t>GET</w:t>
+              <w:t>POST</w:t>
             </w:r>
           </w:p>
         </w:tc>
@@ -10541,7 +10563,7 @@
                 <w:rFonts w:ascii="Consolas" w:hAnsi="Consolas"/>
                 <w:sz w:val="16"/>
               </w:rPr>
-              <w:t>/api/auth/google/callback</w:t>
+              <w:t>/api/auth/forgot-password/verify-otp</w:t>
             </w:r>
             <w:r>
               <w:rPr>
@@ -10588,7 +10610,7 @@
                 <w:rFonts w:ascii="Consolas" w:hAnsi="Consolas"/>
                 <w:sz w:val="16"/>
               </w:rPr>
-              <w:t>?code&amp;state</w:t>
+              <w:t>{ email, code }</w:t>
             </w:r>
             <w:r>
               <w:rPr>
@@ -10611,7 +10633,18 @@
               <w:rPr>
                 <w:sz w:val="16"/>
               </w:rPr>
-              <w:t>Redirect to frontend with token</w:t>
+            </w:r>
+            <w:r>
+              <w:rPr>
+                <w:rFonts w:ascii="Consolas" w:hAnsi="Consolas"/>
+                <w:sz w:val="16"/>
+              </w:rPr>
+              <w:t>{ ok, resetToken }</w:t>
+            </w:r>
+            <w:r>
+              <w:rPr>
+                <w:sz w:val="16"/>
+              </w:rPr>
             </w:r>
           </w:p>
         </w:tc>
@@ -10629,7 +10662,7 @@
               <w:rPr>
                 <w:sz w:val="16"/>
               </w:rPr>
-              <w:t>OAuth callback</w:t>
+              <w:t>Verify reset OTP</w:t>
             </w:r>
           </w:p>
         </w:tc>
@@ -10690,6 +10723,773 @@
                 <w:rFonts w:ascii="Consolas" w:hAnsi="Consolas"/>
                 <w:sz w:val="16"/>
               </w:rPr>
+              <w:t>/api/auth/reset-password</w:t>
+            </w:r>
+            <w:r>
+              <w:rPr>
+                <w:sz w:val="16"/>
+              </w:rPr>
+            </w:r>
+          </w:p>
+        </w:tc>
+        <w:tc>
+          <w:tcPr>
+            <w:tcW w:type="dxa" w:w="1399"/>
+          </w:tcPr>
+          <w:p>
+            <w:r>
+              <w:rPr>
+                <w:sz w:val="16"/>
+              </w:rPr>
+            </w:r>
+            <w:r>
+              <w:rPr>
+                <w:sz w:val="16"/>
+              </w:rPr>
+              <w:t>Public</w:t>
+            </w:r>
+          </w:p>
+        </w:tc>
+        <w:tc>
+          <w:tcPr>
+            <w:tcW w:type="dxa" w:w="1399"/>
+          </w:tcPr>
+          <w:p>
+            <w:r>
+              <w:rPr>
+                <w:sz w:val="16"/>
+              </w:rPr>
+            </w:r>
+            <w:r>
+              <w:rPr>
+                <w:sz w:val="16"/>
+              </w:rPr>
+            </w:r>
+            <w:r>
+              <w:rPr>
+                <w:rFonts w:ascii="Consolas" w:hAnsi="Consolas"/>
+                <w:sz w:val="16"/>
+              </w:rPr>
+              <w:t>{ email, resetToken, password }</w:t>
+            </w:r>
+            <w:r>
+              <w:rPr>
+                <w:sz w:val="16"/>
+              </w:rPr>
+            </w:r>
+          </w:p>
+        </w:tc>
+        <w:tc>
+          <w:tcPr>
+            <w:tcW w:type="dxa" w:w="1399"/>
+          </w:tcPr>
+          <w:p>
+            <w:r>
+              <w:rPr>
+                <w:sz w:val="16"/>
+              </w:rPr>
+            </w:r>
+            <w:r>
+              <w:rPr>
+                <w:sz w:val="16"/>
+              </w:rPr>
+            </w:r>
+            <w:r>
+              <w:rPr>
+                <w:rFonts w:ascii="Consolas" w:hAnsi="Consolas"/>
+                <w:sz w:val="16"/>
+              </w:rPr>
+              <w:t>{ ok, message }</w:t>
+            </w:r>
+            <w:r>
+              <w:rPr>
+                <w:sz w:val="16"/>
+              </w:rPr>
+            </w:r>
+          </w:p>
+        </w:tc>
+        <w:tc>
+          <w:tcPr>
+            <w:tcW w:type="dxa" w:w="1399"/>
+          </w:tcPr>
+          <w:p>
+            <w:r>
+              <w:rPr>
+                <w:sz w:val="16"/>
+              </w:rPr>
+            </w:r>
+            <w:r>
+              <w:rPr>
+                <w:sz w:val="16"/>
+              </w:rPr>
+              <w:t>Set new password</w:t>
+            </w:r>
+          </w:p>
+        </w:tc>
+        <w:tc>
+          <w:tcPr>
+            <w:tcW w:type="dxa" w:w="1399"/>
+          </w:tcPr>
+          <w:p>
+            <w:r>
+              <w:rPr>
+                <w:sz w:val="16"/>
+              </w:rPr>
+            </w:r>
+            <w:r>
+              <w:rPr>
+                <w:sz w:val="16"/>
+              </w:rPr>
+            </w:r>
+          </w:p>
+        </w:tc>
+      </w:tr>
+      <w:tr>
+        <w:tc>
+          <w:tcPr>
+            <w:tcW w:type="dxa" w:w="1399"/>
+          </w:tcPr>
+          <w:p>
+            <w:r>
+              <w:rPr>
+                <w:sz w:val="16"/>
+              </w:rPr>
+            </w:r>
+            <w:r>
+              <w:rPr>
+                <w:sz w:val="16"/>
+              </w:rPr>
+              <w:t>GET</w:t>
+            </w:r>
+          </w:p>
+        </w:tc>
+        <w:tc>
+          <w:tcPr>
+            <w:tcW w:type="dxa" w:w="1399"/>
+          </w:tcPr>
+          <w:p>
+            <w:r>
+              <w:rPr>
+                <w:sz w:val="16"/>
+              </w:rPr>
+            </w:r>
+            <w:r>
+              <w:rPr>
+                <w:sz w:val="16"/>
+              </w:rPr>
+            </w:r>
+            <w:r>
+              <w:rPr>
+                <w:rFonts w:ascii="Consolas" w:hAnsi="Consolas"/>
+                <w:sz w:val="16"/>
+              </w:rPr>
+              <w:t>/api/auth/me</w:t>
+            </w:r>
+            <w:r>
+              <w:rPr>
+                <w:sz w:val="16"/>
+              </w:rPr>
+            </w:r>
+          </w:p>
+        </w:tc>
+        <w:tc>
+          <w:tcPr>
+            <w:tcW w:type="dxa" w:w="1399"/>
+          </w:tcPr>
+          <w:p>
+            <w:r>
+              <w:rPr>
+                <w:sz w:val="16"/>
+              </w:rPr>
+            </w:r>
+            <w:r>
+              <w:rPr>
+                <w:sz w:val="16"/>
+              </w:rPr>
+              <w:t>JWT</w:t>
+            </w:r>
+          </w:p>
+        </w:tc>
+        <w:tc>
+          <w:tcPr>
+            <w:tcW w:type="dxa" w:w="1399"/>
+          </w:tcPr>
+          <w:p>
+            <w:r>
+              <w:rPr>
+                <w:sz w:val="16"/>
+              </w:rPr>
+            </w:r>
+            <w:r>
+              <w:rPr>
+                <w:sz w:val="16"/>
+              </w:rPr>
+              <w:t>—</w:t>
+            </w:r>
+          </w:p>
+        </w:tc>
+        <w:tc>
+          <w:tcPr>
+            <w:tcW w:type="dxa" w:w="1399"/>
+          </w:tcPr>
+          <w:p>
+            <w:r>
+              <w:rPr>
+                <w:sz w:val="16"/>
+              </w:rPr>
+            </w:r>
+            <w:r>
+              <w:rPr>
+                <w:sz w:val="16"/>
+              </w:rPr>
+            </w:r>
+            <w:r>
+              <w:rPr>
+                <w:rFonts w:ascii="Consolas" w:hAnsi="Consolas"/>
+                <w:sz w:val="16"/>
+              </w:rPr>
+              <w:t>{ user }</w:t>
+            </w:r>
+            <w:r>
+              <w:rPr>
+                <w:sz w:val="16"/>
+              </w:rPr>
+            </w:r>
+          </w:p>
+        </w:tc>
+        <w:tc>
+          <w:tcPr>
+            <w:tcW w:type="dxa" w:w="1399"/>
+          </w:tcPr>
+          <w:p>
+            <w:r>
+              <w:rPr>
+                <w:sz w:val="16"/>
+              </w:rPr>
+            </w:r>
+            <w:r>
+              <w:rPr>
+                <w:sz w:val="16"/>
+              </w:rPr>
+              <w:t>Current user + profile</w:t>
+            </w:r>
+          </w:p>
+        </w:tc>
+        <w:tc>
+          <w:tcPr>
+            <w:tcW w:type="dxa" w:w="1399"/>
+          </w:tcPr>
+          <w:p>
+            <w:r>
+              <w:rPr>
+                <w:sz w:val="16"/>
+              </w:rPr>
+            </w:r>
+            <w:r>
+              <w:rPr>
+                <w:sz w:val="16"/>
+              </w:rPr>
+            </w:r>
+          </w:p>
+        </w:tc>
+      </w:tr>
+      <w:tr>
+        <w:tc>
+          <w:tcPr>
+            <w:tcW w:type="dxa" w:w="1399"/>
+          </w:tcPr>
+          <w:p>
+            <w:r>
+              <w:rPr>
+                <w:sz w:val="16"/>
+              </w:rPr>
+            </w:r>
+            <w:r>
+              <w:rPr>
+                <w:sz w:val="16"/>
+              </w:rPr>
+              <w:t>GET</w:t>
+            </w:r>
+          </w:p>
+        </w:tc>
+        <w:tc>
+          <w:tcPr>
+            <w:tcW w:type="dxa" w:w="1399"/>
+          </w:tcPr>
+          <w:p>
+            <w:r>
+              <w:rPr>
+                <w:sz w:val="16"/>
+              </w:rPr>
+            </w:r>
+            <w:r>
+              <w:rPr>
+                <w:sz w:val="16"/>
+              </w:rPr>
+            </w:r>
+            <w:r>
+              <w:rPr>
+                <w:rFonts w:ascii="Consolas" w:hAnsi="Consolas"/>
+                <w:sz w:val="16"/>
+              </w:rPr>
+              <w:t>/api/auth/roles</w:t>
+            </w:r>
+            <w:r>
+              <w:rPr>
+                <w:sz w:val="16"/>
+              </w:rPr>
+            </w:r>
+          </w:p>
+        </w:tc>
+        <w:tc>
+          <w:tcPr>
+            <w:tcW w:type="dxa" w:w="1399"/>
+          </w:tcPr>
+          <w:p>
+            <w:r>
+              <w:rPr>
+                <w:sz w:val="16"/>
+              </w:rPr>
+            </w:r>
+            <w:r>
+              <w:rPr>
+                <w:sz w:val="16"/>
+              </w:rPr>
+              <w:t>Public</w:t>
+            </w:r>
+          </w:p>
+        </w:tc>
+        <w:tc>
+          <w:tcPr>
+            <w:tcW w:type="dxa" w:w="1399"/>
+          </w:tcPr>
+          <w:p>
+            <w:r>
+              <w:rPr>
+                <w:sz w:val="16"/>
+              </w:rPr>
+            </w:r>
+            <w:r>
+              <w:rPr>
+                <w:sz w:val="16"/>
+              </w:rPr>
+              <w:t>—</w:t>
+            </w:r>
+          </w:p>
+        </w:tc>
+        <w:tc>
+          <w:tcPr>
+            <w:tcW w:type="dxa" w:w="1399"/>
+          </w:tcPr>
+          <w:p>
+            <w:r>
+              <w:rPr>
+                <w:sz w:val="16"/>
+              </w:rPr>
+            </w:r>
+            <w:r>
+              <w:rPr>
+                <w:sz w:val="16"/>
+              </w:rPr>
+            </w:r>
+            <w:r>
+              <w:rPr>
+                <w:rFonts w:ascii="Consolas" w:hAnsi="Consolas"/>
+                <w:sz w:val="16"/>
+              </w:rPr>
+              <w:t>{ registerRoles, allRoles }</w:t>
+            </w:r>
+            <w:r>
+              <w:rPr>
+                <w:sz w:val="16"/>
+              </w:rPr>
+            </w:r>
+          </w:p>
+        </w:tc>
+        <w:tc>
+          <w:tcPr>
+            <w:tcW w:type="dxa" w:w="1399"/>
+          </w:tcPr>
+          <w:p>
+            <w:r>
+              <w:rPr>
+                <w:sz w:val="16"/>
+              </w:rPr>
+            </w:r>
+            <w:r>
+              <w:rPr>
+                <w:sz w:val="16"/>
+              </w:rPr>
+              <w:t>Available roles</w:t>
+            </w:r>
+          </w:p>
+        </w:tc>
+        <w:tc>
+          <w:tcPr>
+            <w:tcW w:type="dxa" w:w="1399"/>
+          </w:tcPr>
+          <w:p>
+            <w:r>
+              <w:rPr>
+                <w:sz w:val="16"/>
+              </w:rPr>
+            </w:r>
+            <w:r>
+              <w:rPr>
+                <w:sz w:val="16"/>
+              </w:rPr>
+            </w:r>
+          </w:p>
+        </w:tc>
+      </w:tr>
+      <w:tr>
+        <w:tc>
+          <w:tcPr>
+            <w:tcW w:type="dxa" w:w="1399"/>
+          </w:tcPr>
+          <w:p>
+            <w:r>
+              <w:rPr>
+                <w:sz w:val="16"/>
+              </w:rPr>
+            </w:r>
+            <w:r>
+              <w:rPr>
+                <w:sz w:val="16"/>
+              </w:rPr>
+              <w:t>GET</w:t>
+            </w:r>
+          </w:p>
+        </w:tc>
+        <w:tc>
+          <w:tcPr>
+            <w:tcW w:type="dxa" w:w="1399"/>
+          </w:tcPr>
+          <w:p>
+            <w:r>
+              <w:rPr>
+                <w:sz w:val="16"/>
+              </w:rPr>
+            </w:r>
+            <w:r>
+              <w:rPr>
+                <w:sz w:val="16"/>
+              </w:rPr>
+            </w:r>
+            <w:r>
+              <w:rPr>
+                <w:rFonts w:ascii="Consolas" w:hAnsi="Consolas"/>
+                <w:sz w:val="16"/>
+              </w:rPr>
+              <w:t>/api/auth/google/url</w:t>
+            </w:r>
+            <w:r>
+              <w:rPr>
+                <w:sz w:val="16"/>
+              </w:rPr>
+            </w:r>
+          </w:p>
+        </w:tc>
+        <w:tc>
+          <w:tcPr>
+            <w:tcW w:type="dxa" w:w="1399"/>
+          </w:tcPr>
+          <w:p>
+            <w:r>
+              <w:rPr>
+                <w:sz w:val="16"/>
+              </w:rPr>
+            </w:r>
+            <w:r>
+              <w:rPr>
+                <w:sz w:val="16"/>
+              </w:rPr>
+              <w:t>Public</w:t>
+            </w:r>
+          </w:p>
+        </w:tc>
+        <w:tc>
+          <w:tcPr>
+            <w:tcW w:type="dxa" w:w="1399"/>
+          </w:tcPr>
+          <w:p>
+            <w:r>
+              <w:rPr>
+                <w:sz w:val="16"/>
+              </w:rPr>
+            </w:r>
+            <w:r>
+              <w:rPr>
+                <w:sz w:val="16"/>
+              </w:rPr>
+            </w:r>
+            <w:r>
+              <w:rPr>
+                <w:rFonts w:ascii="Consolas" w:hAnsi="Consolas"/>
+                <w:sz w:val="16"/>
+              </w:rPr>
+              <w:t>?state=login</w:t>
+            </w:r>
+            <w:r>
+              <w:rPr>
+                <w:sz w:val="16"/>
+              </w:rPr>
+            </w:r>
+          </w:p>
+        </w:tc>
+        <w:tc>
+          <w:tcPr>
+            <w:tcW w:type="dxa" w:w="1399"/>
+          </w:tcPr>
+          <w:p>
+            <w:r>
+              <w:rPr>
+                <w:sz w:val="16"/>
+              </w:rPr>
+            </w:r>
+            <w:r>
+              <w:rPr>
+                <w:sz w:val="16"/>
+              </w:rPr>
+            </w:r>
+            <w:r>
+              <w:rPr>
+                <w:rFonts w:ascii="Consolas" w:hAnsi="Consolas"/>
+                <w:sz w:val="16"/>
+              </w:rPr>
+              <w:t>{ url }</w:t>
+            </w:r>
+            <w:r>
+              <w:rPr>
+                <w:sz w:val="16"/>
+              </w:rPr>
+            </w:r>
+          </w:p>
+        </w:tc>
+        <w:tc>
+          <w:tcPr>
+            <w:tcW w:type="dxa" w:w="1399"/>
+          </w:tcPr>
+          <w:p>
+            <w:r>
+              <w:rPr>
+                <w:sz w:val="16"/>
+              </w:rPr>
+            </w:r>
+            <w:r>
+              <w:rPr>
+                <w:sz w:val="16"/>
+              </w:rPr>
+              <w:t>Google OAuth URL</w:t>
+            </w:r>
+          </w:p>
+        </w:tc>
+        <w:tc>
+          <w:tcPr>
+            <w:tcW w:type="dxa" w:w="1399"/>
+          </w:tcPr>
+          <w:p>
+            <w:r>
+              <w:rPr>
+                <w:sz w:val="16"/>
+              </w:rPr>
+            </w:r>
+            <w:r>
+              <w:rPr>
+                <w:sz w:val="16"/>
+              </w:rPr>
+            </w:r>
+          </w:p>
+        </w:tc>
+      </w:tr>
+      <w:tr>
+        <w:tc>
+          <w:tcPr>
+            <w:tcW w:type="dxa" w:w="1399"/>
+          </w:tcPr>
+          <w:p>
+            <w:r>
+              <w:rPr>
+                <w:sz w:val="16"/>
+              </w:rPr>
+            </w:r>
+            <w:r>
+              <w:rPr>
+                <w:sz w:val="16"/>
+              </w:rPr>
+              <w:t>GET</w:t>
+            </w:r>
+          </w:p>
+        </w:tc>
+        <w:tc>
+          <w:tcPr>
+            <w:tcW w:type="dxa" w:w="1399"/>
+          </w:tcPr>
+          <w:p>
+            <w:r>
+              <w:rPr>
+                <w:sz w:val="16"/>
+              </w:rPr>
+            </w:r>
+            <w:r>
+              <w:rPr>
+                <w:sz w:val="16"/>
+              </w:rPr>
+            </w:r>
+            <w:r>
+              <w:rPr>
+                <w:rFonts w:ascii="Consolas" w:hAnsi="Consolas"/>
+                <w:sz w:val="16"/>
+              </w:rPr>
+              <w:t>/api/auth/google/callback</w:t>
+            </w:r>
+            <w:r>
+              <w:rPr>
+                <w:sz w:val="16"/>
+              </w:rPr>
+            </w:r>
+          </w:p>
+        </w:tc>
+        <w:tc>
+          <w:tcPr>
+            <w:tcW w:type="dxa" w:w="1399"/>
+          </w:tcPr>
+          <w:p>
+            <w:r>
+              <w:rPr>
+                <w:sz w:val="16"/>
+              </w:rPr>
+            </w:r>
+            <w:r>
+              <w:rPr>
+                <w:sz w:val="16"/>
+              </w:rPr>
+              <w:t>Public</w:t>
+            </w:r>
+          </w:p>
+        </w:tc>
+        <w:tc>
+          <w:tcPr>
+            <w:tcW w:type="dxa" w:w="1399"/>
+          </w:tcPr>
+          <w:p>
+            <w:r>
+              <w:rPr>
+                <w:sz w:val="16"/>
+              </w:rPr>
+            </w:r>
+            <w:r>
+              <w:rPr>
+                <w:sz w:val="16"/>
+              </w:rPr>
+            </w:r>
+            <w:r>
+              <w:rPr>
+                <w:rFonts w:ascii="Consolas" w:hAnsi="Consolas"/>
+                <w:sz w:val="16"/>
+              </w:rPr>
+              <w:t>?code&amp;state</w:t>
+            </w:r>
+            <w:r>
+              <w:rPr>
+                <w:sz w:val="16"/>
+              </w:rPr>
+            </w:r>
+          </w:p>
+        </w:tc>
+        <w:tc>
+          <w:tcPr>
+            <w:tcW w:type="dxa" w:w="1399"/>
+          </w:tcPr>
+          <w:p>
+            <w:r>
+              <w:rPr>
+                <w:sz w:val="16"/>
+              </w:rPr>
+            </w:r>
+            <w:r>
+              <w:rPr>
+                <w:sz w:val="16"/>
+              </w:rPr>
+              <w:t>Redirect to frontend with token</w:t>
+            </w:r>
+          </w:p>
+        </w:tc>
+        <w:tc>
+          <w:tcPr>
+            <w:tcW w:type="dxa" w:w="1399"/>
+          </w:tcPr>
+          <w:p>
+            <w:r>
+              <w:rPr>
+                <w:sz w:val="16"/>
+              </w:rPr>
+            </w:r>
+            <w:r>
+              <w:rPr>
+                <w:sz w:val="16"/>
+              </w:rPr>
+              <w:t>OAuth callback</w:t>
+            </w:r>
+          </w:p>
+        </w:tc>
+        <w:tc>
+          <w:tcPr>
+            <w:tcW w:type="dxa" w:w="1399"/>
+          </w:tcPr>
+          <w:p>
+            <w:r>
+              <w:rPr>
+                <w:sz w:val="16"/>
+              </w:rPr>
+            </w:r>
+            <w:r>
+              <w:rPr>
+                <w:sz w:val="16"/>
+              </w:rPr>
+            </w:r>
+          </w:p>
+        </w:tc>
+      </w:tr>
+      <w:tr>
+        <w:tc>
+          <w:tcPr>
+            <w:tcW w:type="dxa" w:w="1399"/>
+          </w:tcPr>
+          <w:p>
+            <w:r>
+              <w:rPr>
+                <w:sz w:val="16"/>
+              </w:rPr>
+            </w:r>
+            <w:r>
+              <w:rPr>
+                <w:sz w:val="16"/>
+              </w:rPr>
+              <w:t>POST</w:t>
+            </w:r>
+          </w:p>
+        </w:tc>
+        <w:tc>
+          <w:tcPr>
+            <w:tcW w:type="dxa" w:w="1399"/>
+          </w:tcPr>
+          <w:p>
+            <w:r>
+              <w:rPr>
+                <w:sz w:val="16"/>
+              </w:rPr>
+            </w:r>
+            <w:r>
+              <w:rPr>
+                <w:sz w:val="16"/>
+              </w:rPr>
+            </w:r>
+            <w:r>
+              <w:rPr>
+                <w:rFonts w:ascii="Consolas" w:hAnsi="Consolas"/>
+                <w:sz w:val="16"/>
+              </w:rPr>
               <w:t>/api/auth/google/token</w:t>
             </w:r>
             <w:r>
@@ -10773,7 +11573,7 @@
                 <w:rFonts w:ascii="Consolas" w:hAnsi="Consolas"/>
                 <w:sz w:val="16"/>
               </w:rPr>
-              <w:t>{ token, user }</w:t>
+              <w:t>{ accessToken, refreshToken, token, user }</w:t>
             </w:r>
             <w:r>
               <w:rPr>
@@ -14364,7 +15164,7 @@
         <w:color w:val="666666"/>
         <w:sz w:val="16"/>
       </w:rPr>
-      <w:t xml:space="preserve">© Nexus Lexis · nexuslexis.law  |  Updated: 2026-07-28  |  Page </w:t>
+      <w:t xml:space="preserve">© Nexus Lexis · nexuslexis.law  |  Updated: 2026-07-29  |  Page </w:t>
     </w:r>
     <w:r>
       <w:rPr>
@@ -14391,7 +15191,7 @@
         <w:color w:val="666666"/>
         <w:sz w:val="16"/>
       </w:rPr>
-      <w:t>Nexus Lexis — Complete API Reference  |  NL-DOC-API-001  |  v1.0  |  Internal — Technical Reference</w:t>
+      <w:t>Nexus Lexis — Complete API Reference  |  NL-DOC-API-001  |  v1.1  |  Internal — Technical Reference</w:t>
     </w:r>
   </w:p>
 </w:hdr>

</xml_diff>